<commit_message>
Update contact info: new phone +91 9904461301 and address O-402 SUN ATMOSPHERE NR O7 CLUB SHELA, SANAND, AHMEDABAD, GUJARAT - 380058
</commit_message>
<xml_diff>
--- a/Draft For Website.docx
+++ b/Draft For Website.docx
@@ -13,7 +13,6 @@
       <w:r>
         <w:rPr>
           <w:color w:val="000000"/>
-          <w:vertAlign w:val="baseline"/>
         </w:rPr>
         <w:t xml:space="preserve">Home Page</w:t>
       </w:r>
@@ -30,7 +29,6 @@
       <w:r>
         <w:rPr>
           <w:color w:val="000000"/>
-          <w:vertAlign w:val="baseline"/>
         </w:rPr>
         <w:t xml:space="preserve">Vihana Global Ventures</w:t>
       </w:r>
@@ -48,7 +46,6 @@
         <w:rPr>
           <w:color w:val="000000"/>
           <w:sz w:val="28.08"/>
-          <w:vertAlign w:val="baseline"/>
         </w:rPr>
         <w:t xml:space="preserve">Global Trade Consultants &amp; Import-Export Business Facilitators</w:t>
       </w:r>
@@ -69,14 +66,12 @@
         <w:rPr>
           <w:b w:val="true"/>
           <w:color w:val="000000"/>
-          <w:vertAlign w:val="baseline"/>
         </w:rPr>
         <w:t xml:space="preserve">Vihana Global Ventures</w:t>
       </w:r>
       <w:r>
         <w:rPr>
           <w:color w:val="000000"/>
-          <w:vertAlign w:val="baseline"/>
         </w:rPr>
         <w:t xml:space="preserve">, based in Ahmedabad, is an international trade consulting and business facilitation company dedicated to connecting global manufacturers with the rapidly growing Indian market.</w:t>
       </w:r>
@@ -94,7 +89,6 @@
       <w:r>
         <w:rPr>
           <w:color w:val="000000"/>
-          <w:vertAlign w:val="baseline"/>
         </w:rPr>
         <w:t xml:space="preserve">We specialize in </w:t>
       </w:r>
@@ -102,14 +96,12 @@
         <w:rPr>
           <w:b w:val="true"/>
           <w:color w:val="000000"/>
-          <w:vertAlign w:val="baseline"/>
         </w:rPr>
         <w:t xml:space="preserve">import-export consulting, international sourcing, strategic partnerships, and market entry support</w:t>
       </w:r>
       <w:r>
         <w:rPr>
           <w:color w:val="000000"/>
-          <w:vertAlign w:val="baseline"/>
         </w:rPr>
         <w:t xml:space="preserve">, helping companies establish and expand their business presence in India.</w:t>
       </w:r>
@@ -127,7 +119,6 @@
       <w:r>
         <w:rPr>
           <w:color w:val="000000"/>
-          <w:vertAlign w:val="baseline"/>
         </w:rPr>
         <w:t xml:space="preserve">Vihana Global Ventures is backed by the experience and legacy of </w:t>
       </w:r>
@@ -135,14 +126,12 @@
         <w:rPr>
           <w:b w:val="true"/>
           <w:color w:val="000000"/>
-          <w:vertAlign w:val="baseline"/>
         </w:rPr>
         <w:t xml:space="preserve">A.A. International Group</w:t>
       </w:r>
       <w:r>
         <w:rPr>
           <w:color w:val="000000"/>
-          <w:vertAlign w:val="baseline"/>
         </w:rPr>
         <w:t xml:space="preserve">, pioneers in international trade consulting since </w:t>
       </w:r>
@@ -150,14 +139,12 @@
         <w:rPr>
           <w:b w:val="true"/>
           <w:color w:val="000000"/>
-          <w:vertAlign w:val="baseline"/>
         </w:rPr>
         <w:t xml:space="preserve">1998</w:t>
       </w:r>
       <w:r>
         <w:rPr>
           <w:color w:val="000000"/>
-          <w:vertAlign w:val="baseline"/>
         </w:rPr>
         <w:t xml:space="preserve"> and an </w:t>
       </w:r>
@@ -165,14 +152,12 @@
         <w:rPr>
           <w:b w:val="true"/>
           <w:color w:val="000000"/>
-          <w:vertAlign w:val="baseline"/>
         </w:rPr>
         <w:t xml:space="preserve">ISO 9001 certified organization based in Chennai</w:t>
       </w:r>
       <w:r>
         <w:rPr>
           <w:color w:val="000000"/>
-          <w:vertAlign w:val="baseline"/>
         </w:rPr>
         <w:t xml:space="preserve">.</w:t>
       </w:r>
@@ -184,13 +169,18 @@
       <w:r>
         <w:pict>
           <v:rect xmlns:v="urn:schemas-microsoft-com:vml" xmlns:o="urn:schemas-microsoft-com:office:office" filled="f" fillcolor="#ffffff" strokecolor="000000" strokeweight="1.0pt" id="_x0000_i1025" style="width:468.0pt;height:1.0pt;position:absolute;margin-left:0;margin-top:0;visibility:visible;mso-wrap-style:square;mso-width-percent:0;mso-height-percent:0;mso-wrap-distance-left:9pt;mso-wrap-distance-top:0;mso-wrap-distance-right:9pt;mso-wrap-distance-bottom:0;mso-position-horizontal:left;mso-position-horizontal-relative:text;mso-position-vertical:top;mso-position-vertical-relative:line;mso-width-percent:0;mso-height-percent:0;mso-width-relative:margin;mso-height-relative:margin;v-text-anchor:middle" o:hralign="left" o:hr="t">
-            <v:stroke dashstyle="inset"/>
+            <v:stroke dashstyle="solid"/>
           </v:rect>
         </w:pict>
       </w:r>
     </w:p>
     <w:p xmlns:w14="http://schemas.microsoft.com/office/word/2010/wordml">
       <w:pPr>
+        <w:widowControl w:val="1"/>
+      </w:pPr>
+    </w:p>
+    <w:p xmlns:w14="http://schemas.microsoft.com/office/word/2010/wordml">
+      <w:pPr>
         <w:pStyle w:val="Normal"/>
         <w:spacing w:before="240.0"/>
         <w:rPr>
@@ -207,10 +197,15 @@
       <w:r>
         <w:pict>
           <v:rect xmlns:v="urn:schemas-microsoft-com:vml" xmlns:o="urn:schemas-microsoft-com:office:office" filled="f" fillcolor="#ffffff" strokecolor="000000" strokeweight="1.0pt" id="_x0000_i1025" style="width:468.0pt;height:1.0pt;position:absolute;margin-left:0;margin-top:0;visibility:visible;mso-wrap-style:square;mso-width-percent:0;mso-height-percent:0;mso-wrap-distance-left:9pt;mso-wrap-distance-top:0;mso-wrap-distance-right:9pt;mso-wrap-distance-bottom:0;mso-position-horizontal:left;mso-position-horizontal-relative:text;mso-position-vertical:top;mso-position-vertical-relative:line;mso-width-percent:0;mso-height-percent:0;mso-width-relative:margin;mso-height-relative:margin;v-text-anchor:middle" o:hralign="left" o:hr="t">
-            <v:stroke dashstyle="inset"/>
+            <v:stroke dashstyle="solid"/>
           </v:rect>
         </w:pict>
       </w:r>
+    </w:p>
+    <w:p xmlns:w14="http://schemas.microsoft.com/office/word/2010/wordml">
+      <w:pPr>
+        <w:widowControl w:val="1"/>
+      </w:pPr>
     </w:p>
     <w:p xmlns:w14="http://schemas.microsoft.com/office/word/2010/wordml">
       <w:pPr>
@@ -222,7 +217,6 @@
       <w:r>
         <w:rPr>
           <w:color w:val="000000"/>
-          <w:vertAlign w:val="baseline"/>
         </w:rPr>
         <w:t xml:space="preserve">About Us</w:t>
       </w:r>
@@ -239,7 +233,6 @@
       <w:r>
         <w:rPr>
           <w:color w:val="000000"/>
-          <w:vertAlign w:val="baseline"/>
         </w:rPr>
         <w:t xml:space="preserve">About Vihana Global Ventures</w:t>
       </w:r>
@@ -260,14 +253,12 @@
         <w:rPr>
           <w:b w:val="true"/>
           <w:color w:val="000000"/>
-          <w:vertAlign w:val="baseline"/>
         </w:rPr>
         <w:t xml:space="preserve">Vihana Global Ventures</w:t>
       </w:r>
       <w:r>
         <w:rPr>
           <w:color w:val="000000"/>
-          <w:vertAlign w:val="baseline"/>
         </w:rPr>
         <w:t xml:space="preserve"> is an international trade consulting and business facilitation company based in </w:t>
       </w:r>
@@ -275,14 +266,12 @@
         <w:rPr>
           <w:b w:val="true"/>
           <w:color w:val="000000"/>
-          <w:vertAlign w:val="baseline"/>
         </w:rPr>
         <w:t xml:space="preserve">Ahmedabad, India</w:t>
       </w:r>
       <w:r>
         <w:rPr>
           <w:color w:val="000000"/>
-          <w:vertAlign w:val="baseline"/>
         </w:rPr>
         <w:t xml:space="preserve">, focused on enabling seamless global trade between international manufacturers and the Indian market.</w:t>
       </w:r>
@@ -300,7 +289,6 @@
       <w:r>
         <w:rPr>
           <w:color w:val="000000"/>
-          <w:vertAlign w:val="baseline"/>
         </w:rPr>
         <w:t xml:space="preserve">We assist global companies in expanding their presence in India by providing </w:t>
       </w:r>
@@ -308,14 +296,12 @@
         <w:rPr>
           <w:b w:val="true"/>
           <w:color w:val="000000"/>
-          <w:vertAlign w:val="baseline"/>
         </w:rPr>
         <w:t xml:space="preserve">import-export consulting, international sourcing solutions, strategic partnerships, and market entry support</w:t>
       </w:r>
       <w:r>
         <w:rPr>
           <w:color w:val="000000"/>
-          <w:vertAlign w:val="baseline"/>
         </w:rPr>
         <w:t xml:space="preserve">.</w:t>
       </w:r>
@@ -333,7 +319,6 @@
       <w:r>
         <w:rPr>
           <w:color w:val="000000"/>
-          <w:vertAlign w:val="baseline"/>
         </w:rPr>
         <w:t xml:space="preserve">Our objective is to simplify international trade and create long-term business opportunities for both global suppliers and Indian industrial buyers.</w:t>
       </w:r>
@@ -351,7 +336,6 @@
       <w:r>
         <w:rPr>
           <w:color w:val="000000"/>
-          <w:vertAlign w:val="baseline"/>
         </w:rPr>
         <w:t xml:space="preserve">Vihana Global Ventures operates with the experience and guidance of </w:t>
       </w:r>
@@ -359,14 +343,12 @@
         <w:rPr>
           <w:b w:val="true"/>
           <w:color w:val="000000"/>
-          <w:vertAlign w:val="baseline"/>
         </w:rPr>
         <w:t xml:space="preserve">A.A. International Group</w:t>
       </w:r>
       <w:r>
         <w:rPr>
           <w:color w:val="000000"/>
-          <w:vertAlign w:val="baseline"/>
         </w:rPr>
         <w:t xml:space="preserve">, an </w:t>
       </w:r>
@@ -374,14 +356,12 @@
         <w:rPr>
           <w:b w:val="true"/>
           <w:color w:val="000000"/>
-          <w:vertAlign w:val="baseline"/>
         </w:rPr>
         <w:t xml:space="preserve">ISO 9001 certified international business consulting firm based in Chennai</w:t>
       </w:r>
       <w:r>
         <w:rPr>
           <w:color w:val="000000"/>
-          <w:vertAlign w:val="baseline"/>
         </w:rPr>
         <w:t xml:space="preserve">, which has been actively involved in international trade and industrial sourcing since </w:t>
       </w:r>
@@ -389,14 +369,12 @@
         <w:rPr>
           <w:b w:val="true"/>
           <w:color w:val="000000"/>
-          <w:vertAlign w:val="baseline"/>
         </w:rPr>
         <w:t xml:space="preserve">1998</w:t>
       </w:r>
       <w:r>
         <w:rPr>
           <w:color w:val="000000"/>
-          <w:vertAlign w:val="baseline"/>
         </w:rPr>
         <w:t xml:space="preserve">.</w:t>
       </w:r>
@@ -408,10 +386,15 @@
       <w:r>
         <w:pict>
           <v:rect xmlns:v="urn:schemas-microsoft-com:vml" xmlns:o="urn:schemas-microsoft-com:office:office" filled="f" fillcolor="#ffffff" strokecolor="000000" strokeweight="1.0pt" id="_x0000_i1025" style="width:468.0pt;height:1.0pt;position:absolute;margin-left:0;margin-top:0;visibility:visible;mso-wrap-style:square;mso-width-percent:0;mso-height-percent:0;mso-wrap-distance-left:9pt;mso-wrap-distance-top:0;mso-wrap-distance-right:9pt;mso-wrap-distance-bottom:0;mso-position-horizontal:left;mso-position-horizontal-relative:text;mso-position-vertical:top;mso-position-vertical-relative:line;mso-width-percent:0;mso-height-percent:0;mso-width-relative:margin;mso-height-relative:margin;v-text-anchor:middle" o:hralign="left" o:hr="t">
-            <v:stroke dashstyle="inset"/>
+            <v:stroke dashstyle="solid"/>
           </v:rect>
         </w:pict>
       </w:r>
+    </w:p>
+    <w:p xmlns:w14="http://schemas.microsoft.com/office/word/2010/wordml">
+      <w:pPr>
+        <w:widowControl w:val="1"/>
+      </w:pPr>
     </w:p>
     <w:p xmlns:w14="http://schemas.microsoft.com/office/word/2010/wordml">
       <w:pPr>
@@ -423,7 +406,6 @@
       <w:r>
         <w:rPr>
           <w:color w:val="000000"/>
-          <w:vertAlign w:val="baseline"/>
         </w:rPr>
         <w:t xml:space="preserve">Our Experience &amp; Legacy</w:t>
       </w:r>
@@ -443,7 +425,6 @@
       <w:r>
         <w:rPr>
           <w:color w:val="000000"/>
-          <w:vertAlign w:val="baseline"/>
         </w:rPr>
         <w:t xml:space="preserve">For over </w:t>
       </w:r>
@@ -451,14 +432,12 @@
         <w:rPr>
           <w:b w:val="true"/>
           <w:color w:val="000000"/>
-          <w:vertAlign w:val="baseline"/>
         </w:rPr>
         <w:t xml:space="preserve">two decades</w:t>
       </w:r>
       <w:r>
         <w:rPr>
           <w:color w:val="000000"/>
-          <w:vertAlign w:val="baseline"/>
         </w:rPr>
         <w:t xml:space="preserve">, our group has worked closely with international manufacturers across </w:t>
       </w:r>
@@ -466,14 +445,12 @@
         <w:rPr>
           <w:b w:val="true"/>
           <w:color w:val="000000"/>
-          <w:vertAlign w:val="baseline"/>
         </w:rPr>
         <w:t xml:space="preserve">China, Europe, and other global markets</w:t>
       </w:r>
       <w:r>
         <w:rPr>
           <w:color w:val="000000"/>
-          <w:vertAlign w:val="baseline"/>
         </w:rPr>
         <w:t xml:space="preserve">, helping them connect with some of India’s largest industrial organizations.</w:t>
       </w:r>
@@ -485,7 +462,6 @@
         <w:rPr>
           <w:color w:val="000000"/>
           <w:sz w:val="24.0"/>
-          <w:vertAlign w:val="baseline"/>
         </w:rPr>
         <w:widowControl w:val="1"/>
       </w:pPr>
@@ -499,8 +475,6 @@
           <w:spacing w:val="0"/>
           <w:sz w:val="24.0"/>
           <w:u w:val="none"/>
-          <w:shd w:fill="auto" w:val="clear" w:color="auto"/>
-          <w:vertAlign w:val="baseline"/>
         </w:rPr>
         <w:t xml:space="preserve">Our experience includes facilitating the supply of </w:t>
       </w:r>
@@ -514,8 +488,6 @@
           <w:spacing w:val="0"/>
           <w:sz w:val="24.0"/>
           <w:u w:val="none"/>
-          <w:shd w:fill="auto" w:val="clear" w:color="auto"/>
-          <w:vertAlign w:val="baseline"/>
         </w:rPr>
         <w:t xml:space="preserve">over 10 lakh metric tons of industrial products</w:t>
       </w:r>
@@ -529,8 +501,6 @@
           <w:spacing w:val="0"/>
           <w:sz w:val="24.0"/>
           <w:u w:val="none"/>
-          <w:shd w:fill="auto" w:val="clear" w:color="auto"/>
-          <w:vertAlign w:val="baseline"/>
         </w:rPr>
         <w:t xml:space="preserve"> to leading Indian companies, particularly in sectors such as </w:t>
       </w:r>
@@ -544,8 +514,6 @@
           <w:spacing w:val="0"/>
           <w:sz w:val="24.0"/>
           <w:u w:val="none"/>
-          <w:shd w:fill="auto" w:val="clear" w:color="auto"/>
-          <w:vertAlign w:val="baseline"/>
         </w:rPr>
         <w:t xml:space="preserve">power generation, heavy engineering, and industrial manufacturing</w:t>
       </w:r>
@@ -559,8 +527,6 @@
           <w:spacing w:val="0"/>
           <w:sz w:val="24.0"/>
           <w:u w:val="none"/>
-          <w:shd w:fill="auto" w:val="clear" w:color="auto"/>
-          <w:vertAlign w:val="baseline"/>
         </w:rPr>
         <w:t xml:space="preserve">.</w:t>
       </w:r>
@@ -578,7 +544,6 @@
       <w:r>
         <w:rPr>
           <w:color w:val="000000"/>
-          <w:vertAlign w:val="baseline"/>
         </w:rPr>
         <w:t xml:space="preserve">A significant milestone in our journey was in </w:t>
       </w:r>
@@ -586,14 +551,12 @@
         <w:rPr>
           <w:b w:val="true"/>
           <w:color w:val="000000"/>
-          <w:vertAlign w:val="baseline"/>
         </w:rPr>
         <w:t xml:space="preserve">1998</w:t>
       </w:r>
       <w:r>
         <w:rPr>
           <w:color w:val="000000"/>
-          <w:vertAlign w:val="baseline"/>
         </w:rPr>
         <w:t xml:space="preserve">, when our group played a key role in facilitating the supply of </w:t>
       </w:r>
@@ -601,14 +564,12 @@
         <w:rPr>
           <w:b w:val="true"/>
           <w:color w:val="000000"/>
-          <w:vertAlign w:val="baseline"/>
         </w:rPr>
         <w:t xml:space="preserve">seamless pipes from China to BHEL</w:t>
       </w:r>
       <w:r>
         <w:rPr>
           <w:color w:val="000000"/>
-          <w:vertAlign w:val="baseline"/>
         </w:rPr>
         <w:t xml:space="preserve">, making us one of the earliest companies involved in this international trade segment.</w:t>
       </w:r>
@@ -620,7 +581,6 @@
         <w:outlineLvl w:val="1"/>
         <w:rPr>
           <w:color w:val="000000"/>
-          <w:vertAlign w:val="baseline"/>
         </w:rPr>
         <w:widowControl w:val="1"/>
       </w:pPr>
@@ -634,8 +594,6 @@
           <w:spacing w:val="0"/>
           <w:sz w:val="24.0"/>
           <w:u w:val="none"/>
-          <w:shd w:fill="auto" w:val="clear" w:color="auto"/>
-          <w:vertAlign w:val="baseline"/>
         </w:rPr>
         <w:t xml:space="preserve">Our strong relationships with buyers have been built over </w:t>
       </w:r>
@@ -649,8 +607,6 @@
           <w:spacing w:val="0"/>
           <w:sz w:val="24.0"/>
           <w:u w:val="none"/>
-          <w:shd w:fill="auto" w:val="clear" w:color="auto"/>
-          <w:vertAlign w:val="baseline"/>
         </w:rPr>
         <w:t xml:space="preserve">more than 30 years</w:t>
       </w:r>
@@ -664,8 +620,6 @@
           <w:spacing w:val="0"/>
           <w:sz w:val="24.0"/>
           <w:u w:val="none"/>
-          <w:shd w:fill="auto" w:val="clear" w:color="auto"/>
-          <w:vertAlign w:val="baseline"/>
         </w:rPr>
         <w:t xml:space="preserve">, based on </w:t>
       </w:r>
@@ -679,8 +633,6 @@
           <w:spacing w:val="0"/>
           <w:sz w:val="24.0"/>
           <w:u w:val="none"/>
-          <w:shd w:fill="auto" w:val="clear" w:color="auto"/>
-          <w:vertAlign w:val="baseline"/>
         </w:rPr>
         <w:t xml:space="preserve">trust, reliability, and long-term partnerships</w:t>
       </w:r>
@@ -694,8 +646,6 @@
           <w:spacing w:val="0"/>
           <w:sz w:val="24.0"/>
           <w:u w:val="none"/>
-          <w:shd w:fill="auto" w:val="clear" w:color="auto"/>
-          <w:vertAlign w:val="baseline"/>
         </w:rPr>
         <w:t xml:space="preserve">.</w:t>
       </w:r>
@@ -725,7 +675,6 @@
         <w:rPr>
           <w:b w:val="true"/>
           <w:color w:val="000000"/>
-          <w:vertAlign w:val="baseline"/>
         </w:rPr>
         <w:t xml:space="preserve">Vision</w:t>
       </w:r>
@@ -735,7 +684,6 @@
       <w:r>
         <w:rPr>
           <w:color w:val="000000"/>
-          <w:vertAlign w:val="baseline"/>
         </w:rPr>
         <w:t xml:space="preserve"> To be a trusted bridge in global trade, connecting international markets with Indian industries and enabling sustainable import and export partnerships.</w:t>
       </w:r>
@@ -754,7 +702,6 @@
         <w:rPr>
           <w:b w:val="true"/>
           <w:color w:val="000000"/>
-          <w:vertAlign w:val="baseline"/>
         </w:rPr>
         <w:t xml:space="preserve">Mission</w:t>
       </w:r>
@@ -764,7 +711,6 @@
       <w:r>
         <w:rPr>
           <w:color w:val="000000"/>
-          <w:vertAlign w:val="baseline"/>
         </w:rPr>
         <w:t xml:space="preserve"> To support businesses in expanding globally by facilitating imports into India, promoting exports from India, and building reliable international trade networks.</w:t>
       </w:r>
@@ -792,7 +738,6 @@
           <w:rFonts w:ascii="Inter Regular" w:eastAsia="Inter Regular" w:hAnsi="Inter Regular" w:cs="Inter Regular"/>
           <w:color w:val="000000"/>
           <w:sz w:val="36.0"/>
-          <w:vertAlign w:val="baseline"/>
         </w:rPr>
         <w:t xml:space="preserve">Core Values</w:t>
       </w:r>
@@ -817,7 +762,6 @@
         <w:rPr>
           <w:rFonts w:ascii="Inter Regular" w:eastAsia="Inter Regular" w:hAnsi="Inter Regular" w:cs="Inter Regular"/>
           <w:color w:val="000000"/>
-          <w:vertAlign w:val="baseline"/>
         </w:rPr>
         <w:t xml:space="preserve">✓ Integrity in all dealings</w:t>
       </w:r>
@@ -840,7 +784,6 @@
         <w:rPr>
           <w:rFonts w:ascii="Inter Regular" w:eastAsia="Inter Regular" w:hAnsi="Inter Regular" w:cs="Inter Regular"/>
           <w:color w:val="000000"/>
-          <w:vertAlign w:val="baseline"/>
         </w:rPr>
         <w:t xml:space="preserve">✓ Excellence in service</w:t>
       </w:r>
@@ -863,7 +806,6 @@
         <w:rPr>
           <w:rFonts w:ascii="Inter Regular" w:eastAsia="Inter Regular" w:hAnsi="Inter Regular" w:cs="Inter Regular"/>
           <w:color w:val="000000"/>
-          <w:vertAlign w:val="baseline"/>
         </w:rPr>
         <w:t xml:space="preserve">✓ Innovation &amp; growth</w:t>
       </w:r>
@@ -886,7 +828,6 @@
         <w:rPr>
           <w:rFonts w:ascii="Inter Regular" w:eastAsia="Inter Regular" w:hAnsi="Inter Regular" w:cs="Inter Regular"/>
           <w:color w:val="000000"/>
-          <w:vertAlign w:val="baseline"/>
         </w:rPr>
         <w:t xml:space="preserve">✓ Transparency always</w:t>
       </w:r>
@@ -909,7 +850,6 @@
         <w:rPr>
           <w:rFonts w:ascii="Inter Regular" w:eastAsia="Inter Regular" w:hAnsi="Inter Regular" w:cs="Inter Regular"/>
           <w:color w:val="000000"/>
-          <w:vertAlign w:val="baseline"/>
         </w:rPr>
         <w:t xml:space="preserve">✓ </w:t>
       </w:r>
@@ -923,8 +863,6 @@
           <w:spacing w:val="0"/>
           <w:sz w:val="24.0"/>
           <w:u w:val="none"/>
-          <w:shd w:fill="auto" w:val="clear" w:color="auto"/>
-          <w:vertAlign w:val="baseline"/>
         </w:rPr>
         <w:t xml:space="preserve">Long-Term Partnerships</w:t>
       </w:r>
@@ -968,7 +906,6 @@
         <w:rPr>
           <w:color w:val="000000"/>
           <w:sz w:val="28.08"/>
-          <w:vertAlign w:val="baseline"/>
         </w:rPr>
         <w:t xml:space="preserve">Import Consulting</w:t>
       </w:r>
@@ -988,7 +925,6 @@
       <w:r>
         <w:rPr>
           <w:color w:val="000000"/>
-          <w:vertAlign w:val="baseline"/>
         </w:rPr>
         <w:t xml:space="preserve">We assist Indian businesses in sourcing reliable products from international markets by connecting them with trusted global manufacturers and suppliers.</w:t>
       </w:r>
@@ -1004,7 +940,6 @@
         <w:rPr>
           <w:color w:val="000000"/>
           <w:sz w:val="28.08"/>
-          <w:vertAlign w:val="baseline"/>
         </w:rPr>
         <w:t xml:space="preserve">Export Support</w:t>
       </w:r>
@@ -1024,7 +959,6 @@
       <w:r>
         <w:rPr>
           <w:color w:val="000000"/>
-          <w:vertAlign w:val="baseline"/>
         </w:rPr>
         <w:t xml:space="preserve">We help Indian companies expand globally by facilitating export opportunities and connecting them with international buyers and business partners.</w:t>
       </w:r>
@@ -1040,7 +974,6 @@
         <w:rPr>
           <w:color w:val="000000"/>
           <w:sz w:val="28.08"/>
-          <w:vertAlign w:val="baseline"/>
         </w:rPr>
         <w:t xml:space="preserve">International Sourcing</w:t>
       </w:r>
@@ -1060,7 +993,6 @@
       <w:r>
         <w:rPr>
           <w:color w:val="000000"/>
-          <w:vertAlign w:val="baseline"/>
         </w:rPr>
         <w:t xml:space="preserve">Through our global network, we identify and connect businesses with reliable suppliers across China, Europe, and other international markets.</w:t>
       </w:r>
@@ -1076,7 +1008,6 @@
         <w:rPr>
           <w:color w:val="000000"/>
           <w:sz w:val="28.08"/>
-          <w:vertAlign w:val="baseline"/>
         </w:rPr>
         <w:t xml:space="preserve">Market Entry Strategy</w:t>
       </w:r>
@@ -1096,7 +1027,6 @@
       <w:r>
         <w:rPr>
           <w:color w:val="000000"/>
-          <w:vertAlign w:val="baseline"/>
         </w:rPr>
         <w:t xml:space="preserve">We support international manufacturers who want to enter the Indian market by providing strategic guidance, industry connections, and business development support.</w:t>
       </w:r>
@@ -1112,7 +1042,6 @@
         <w:rPr>
           <w:color w:val="000000"/>
           <w:sz w:val="28.08"/>
-          <w:vertAlign w:val="baseline"/>
         </w:rPr>
         <w:t xml:space="preserve">Business Representation</w:t>
       </w:r>
@@ -1132,7 +1061,6 @@
       <w:r>
         <w:rPr>
           <w:color w:val="000000"/>
-          <w:vertAlign w:val="baseline"/>
         </w:rPr>
         <w:t xml:space="preserve">We represent global manufacturers as consultants or commission agents, helping them establish relationships with leading companies in India.</w:t>
       </w:r>
@@ -1148,7 +1076,6 @@
         <w:rPr>
           <w:color w:val="000000"/>
           <w:sz w:val="28.08"/>
-          <w:vertAlign w:val="baseline"/>
         </w:rPr>
         <w:t xml:space="preserve">Global Trade Facilitation</w:t>
       </w:r>
@@ -1168,7 +1095,6 @@
       <w:r>
         <w:rPr>
           <w:color w:val="000000"/>
-          <w:vertAlign w:val="baseline"/>
         </w:rPr>
         <w:t xml:space="preserve">We simplify international trade processes by building partnerships between buyers and suppliers, ensuring smooth and efficient business collaboration.</w:t>
       </w:r>
@@ -1516,7 +1442,7 @@
   <w:docDefaults>
     <w:rPrDefault>
       <w:rPr>
-        <w:rFonts w:asciiTheme="minorHAnsi" w:eastAsiaTheme="minorHAnsi" w:hAnsiTheme="minorHAnsi" w:cstheme="minorHAnsi"/>
+        <w:rFonts w:ascii="Roboto" w:eastAsia="Roboto" w:hAnsi="Roboto" w:cs="Roboto"/>
         <w:color w:val="000000" w:themeColor="dark1"/>
         <w:sz w:val="24"/>
       </w:rPr>
@@ -1539,10 +1465,11 @@
       <w:widowControl w:val="1"/>
     </w:pPr>
     <w:rPr>
-      <w:rFonts w:asciiTheme="minorHAnsi" w:eastAsiaTheme="minorHAnsi" w:hAnsiTheme="minorHAnsi" w:cstheme="minorHAnsi"/>
+      <w:rFonts w:ascii="Roboto" w:eastAsia="Roboto" w:hAnsi="Roboto" w:cs="Roboto"/>
       <w:color w:val="000000" w:themeColor="dark1"/>
       <w:sz w:val="24"/>
     </w:rPr>
+    <w:aliases w:val="Normal"/>
     <w:unhideWhenUsed/>
     <w:qFormat/>
   </w:style>
@@ -1559,10 +1486,11 @@
     </w:pPr>
     <w:rPr>
       <w:b w:val="true"/>
-      <w:rFonts w:asciiTheme="majorHAnsi" w:eastAsiaTheme="majorHAnsi" w:hAnsiTheme="majorHAnsi" w:cstheme="majorHAnsi"/>
+      <w:rFonts w:ascii="Roboto" w:eastAsia="Roboto" w:hAnsi="Roboto" w:cs="Roboto"/>
       <w:color w:val="000000" w:themeColor="dark1" w:themeTint="F2"/>
       <w:sz w:val="48"/>
     </w:rPr>
+    <w:aliases w:val="Heading 1"/>
     <w:unhideWhenUsed/>
     <w:qFormat/>
   </w:style>
@@ -1579,10 +1507,11 @@
     </w:pPr>
     <w:rPr>
       <w:b w:val="true"/>
-      <w:rFonts w:asciiTheme="majorHAnsi" w:eastAsiaTheme="majorHAnsi" w:hAnsiTheme="majorHAnsi" w:cstheme="majorHAnsi"/>
+      <w:rFonts w:ascii="Roboto" w:eastAsia="Roboto" w:hAnsi="Roboto" w:cs="Roboto"/>
       <w:color w:val="000000" w:themeColor="dark1"/>
       <w:sz w:val="36"/>
     </w:rPr>
+    <w:aliases w:val="Heading 2"/>
     <w:unhideWhenUsed/>
     <w:qFormat/>
   </w:style>
@@ -1599,10 +1528,11 @@
     </w:pPr>
     <w:rPr>
       <w:b w:val="true"/>
-      <w:rFonts w:asciiTheme="majorHAnsi" w:eastAsiaTheme="majorHAnsi" w:hAnsiTheme="majorHAnsi" w:cstheme="majorHAnsi"/>
+      <w:rFonts w:ascii="Roboto" w:eastAsia="Roboto" w:hAnsi="Roboto" w:cs="Roboto"/>
       <w:color w:val="000000" w:themeColor="dark1"/>
       <w:sz w:val="32"/>
     </w:rPr>
+    <w:aliases w:val="Heading 3"/>
     <w:unhideWhenUsed/>
     <w:qFormat/>
   </w:style>
@@ -1619,11 +1549,12 @@
     </w:pPr>
     <w:rPr>
       <w:b w:val="true"/>
-      <w:rFonts w:asciiTheme="majorHAnsi" w:eastAsiaTheme="majorHAnsi" w:hAnsiTheme="majorHAnsi" w:cstheme="majorHAnsi"/>
+      <w:rFonts w:ascii="Roboto" w:eastAsia="Roboto" w:hAnsi="Roboto" w:cs="Roboto"/>
       <w:i w:val="true"/>
       <w:color w:val="000000" w:themeColor="dark1"/>
       <w:sz w:val="28"/>
     </w:rPr>
+    <w:aliases w:val="Heading 4"/>
     <w:unhideWhenUsed/>
     <w:qFormat/>
   </w:style>
@@ -1637,19 +1568,20 @@
       <w:spacing w:line="311.9999885559082" w:after="160.0"/>
       <w:shd w:fill="000000" w:val="clear" w:color="auto" w:themeFillTint="BF" w:themeFill="text1"/>
       <w:pBdr>
-        <w:top w:val="none" w:color="000000" w:themeColor="dark1" w:sz="0" w:space="0"/>
-        <w:left w:val="none" w:color="000000" w:themeColor="dark1" w:sz="0" w:space="3"/>
-        <w:bottom w:val="none" w:color="000000" w:themeColor="dark1" w:sz="0" w:space="0"/>
-        <w:right w:val="none" w:color="000000" w:themeColor="dark1" w:sz="0" w:space="3"/>
+        <w:top w:val="none" w:color="000000" w:sz="0" w:space="0"/>
+        <w:left w:val="none" w:color="000000" w:sz="0" w:space="0"/>
+        <w:bottom w:val="none" w:color="000000" w:sz="0" w:space="0"/>
+        <w:right w:val="none" w:color="000000" w:sz="0" w:space="0"/>
       </w:pBdr>
       <w:jc w:val="left"/>
       <w:widowControl w:val="1"/>
     </w:pPr>
     <w:rPr>
-      <w:rFonts w:asciiTheme="majorHAnsi" w:eastAsiaTheme="majorHAnsi" w:hAnsiTheme="majorHAnsi" w:cstheme="majorHAnsi"/>
+      <w:rFonts w:ascii="Roboto" w:eastAsia="Roboto" w:hAnsi="Roboto" w:cs="Roboto"/>
       <w:color w:val="FFFFFF" w:themeColor="light1"/>
       <w:sz w:val="24"/>
     </w:rPr>
+    <w:aliases w:val="Heading 5"/>
     <w:unhideWhenUsed/>
     <w:qFormat/>
   </w:style>
@@ -1665,12 +1597,13 @@
       <w:widowControl w:val="1"/>
     </w:pPr>
     <w:rPr>
-      <w:rFonts w:asciiTheme="majorHAnsi" w:eastAsiaTheme="majorHAnsi" w:hAnsiTheme="majorHAnsi" w:cstheme="majorHAnsi"/>
+      <w:rFonts w:ascii="Roboto" w:eastAsia="Roboto" w:hAnsi="Roboto" w:cs="Roboto"/>
       <w:i w:val="true"/>
       <w:color w:val="000000" w:themeColor="dark1"/>
       <w:sz w:val="22"/>
       <w:u w:val="single"/>
     </w:rPr>
+    <w:aliases w:val="Heading 6"/>
     <w:unhideWhenUsed/>
     <w:qFormat/>
   </w:style>
@@ -1685,11 +1618,12 @@
       <w:widowControl w:val="1"/>
     </w:pPr>
     <w:rPr>
-      <w:rFonts w:asciiTheme="majorHAnsi" w:eastAsiaTheme="majorHAnsi" w:hAnsiTheme="majorHAnsi" w:cstheme="majorHAnsi"/>
+      <w:rFonts w:ascii="Roboto" w:eastAsia="Roboto" w:hAnsi="Roboto" w:cs="Roboto"/>
       <w:i w:val="true"/>
       <w:color w:val="447DE2" w:themeColor="accent1" w:themeShade="7F"/>
       <w:sz w:val="20"/>
     </w:rPr>
+    <w:aliases w:val="Heading 7"/>
     <w:unhideWhenUsed/>
     <w:qFormat/>
   </w:style>
@@ -1705,10 +1639,11 @@
     </w:pPr>
     <w:rPr>
       <w:b w:val="true"/>
-      <w:rFonts w:asciiTheme="majorHAnsi" w:eastAsiaTheme="majorHAnsi" w:hAnsiTheme="majorHAnsi" w:cstheme="majorHAnsi"/>
+      <w:rFonts w:ascii="Roboto" w:eastAsia="Roboto" w:hAnsi="Roboto" w:cs="Roboto"/>
       <w:color w:val="26543D" w:themeColor="dark2"/>
       <w:sz w:val="20"/>
     </w:rPr>
+    <w:aliases w:val="Heading 8"/>
     <w:unhideWhenUsed/>
     <w:qFormat/>
   </w:style>
@@ -1724,11 +1659,12 @@
     </w:pPr>
     <w:rPr>
       <w:b w:val="true"/>
-      <w:rFonts w:asciiTheme="majorHAnsi" w:eastAsiaTheme="majorHAnsi" w:hAnsiTheme="majorHAnsi" w:cstheme="majorHAnsi"/>
+      <w:rFonts w:ascii="Roboto" w:eastAsia="Roboto" w:hAnsi="Roboto" w:cs="Roboto"/>
       <w:i w:val="true"/>
       <w:color w:val="26543D" w:themeColor="dark2"/>
       <w:sz w:val="20"/>
     </w:rPr>
+    <w:aliases w:val="Heading 9"/>
     <w:unhideWhenUsed/>
     <w:qFormat/>
   </w:style>
@@ -1737,7 +1673,6 @@
     <w:uiPriority w:val="1"/>
     <w:basedOn w:val="Normal"/>
     <w:next w:val="Normal"/>
-    <w:link w:val="TitleChar"/>
     <w:pPr>
       <w:spacing w:line="240.0" w:after="360.0"/>
       <w:jc w:val="left"/>
@@ -1745,10 +1680,31 @@
     </w:pPr>
     <w:rPr>
       <w:b w:val="true"/>
-      <w:rFonts w:asciiTheme="majorHAnsi" w:eastAsiaTheme="majorHAnsi" w:hAnsiTheme="majorHAnsi" w:cstheme="majorHAnsi"/>
+      <w:rFonts w:ascii="Roboto" w:eastAsia="Roboto" w:hAnsi="Roboto" w:cs="Roboto"/>
       <w:color w:val="447DE2" w:themeColor="accent1" w:themeShade="BF"/>
       <w:spacing w:val="0"/>
       <w:sz w:val="72"/>
+    </w:rPr>
+    <w:aliases w:val="Title"/>
+    <w:unhideWhenUsed/>
+    <w:qFormat/>
+  </w:style>
+  <w:style w:type="paragraph" w:styleId="Subtitle">
+    <w:name w:val="Subtitle"/>
+    <w:uiPriority w:val="1"/>
+    <w:basedOn w:val="Normal"/>
+    <w:next w:val="Normal"/>
+    <w:pPr>
+      <w:spacing w:line="240.0" w:after="480.0" w:before="240.0"/>
+      <w:jc w:val="left"/>
+      <w:widowControl w:val="1"/>
+    </w:pPr>
+    <w:rPr>
+      <w:b w:val="true"/>
+      <w:rFonts w:ascii="Roboto" w:eastAsia="Roboto" w:hAnsi="Roboto" w:cs="Roboto"/>
+      <w:i w:val="true"/>
+      <w:color w:val="404040"/>
+      <w:sz w:val="24"/>
     </w:rPr>
     <w:unhideWhenUsed/>
     <w:qFormat/>
@@ -1783,18 +1739,19 @@
       <w:spacing w:line="311.9999885559082" w:after="360.0"/>
       <w:shd w:fill="447DE2" w:val="clear" w:color="auto" w:themeFillTint="33" w:themeFill="accent1"/>
       <w:pBdr>
-        <w:top w:val="single" w:color="000000" w:space="7"/>
+        <w:top w:val="none" w:color="000000" w:sz="0" w:space="7"/>
         <w:left w:val="single" w:color="447DE2" w:themeColor="accent1" w:themeShade="BF" w:sz="24" w:space="7"/>
-        <w:bottom w:val="single" w:color="000000" w:space="7"/>
+        <w:bottom w:val="none" w:color="000000" w:sz="0" w:space="7"/>
       </w:pBdr>
       <w:jc w:val="left"/>
       <w:widowControl w:val="1"/>
     </w:pPr>
     <w:rPr>
-      <w:rFonts w:asciiTheme="minorHAnsi" w:eastAsiaTheme="minorHAnsi" w:hAnsiTheme="minorHAnsi" w:cstheme="minorHAnsi"/>
+      <w:rFonts w:ascii="Roboto" w:eastAsia="Roboto" w:hAnsi="Roboto" w:cs="Roboto"/>
       <w:color w:val="000000" w:themeColor="dark1"/>
       <w:sz w:val="24"/>
     </w:rPr>
+    <w:aliases w:val="Quote"/>
     <w:unhideWhenUsed/>
     <w:qFormat/>
   </w:style>
@@ -1812,10 +1769,11 @@
       <w:ind w:left="1224" w:right="1224"/>
     </w:pPr>
     <w:rPr>
-      <w:rFonts w:asciiTheme="majorHAnsi" w:eastAsiaTheme="majorHAnsi" w:hAnsiTheme="majorHAnsi" w:cstheme="majorHAnsi"/>
+      <w:rFonts w:ascii="Roboto" w:eastAsia="Roboto" w:hAnsi="Roboto" w:cs="Roboto"/>
       <w:color w:val="447DE2" w:themeColor="accent1"/>
       <w:sz w:val="28"/>
     </w:rPr>
+    <w:aliases w:val="Intense Quote"/>
     <w:unhideWhenUsed/>
     <w:qFormat/>
   </w:style>
@@ -1830,6 +1788,7 @@
       <w:ind w:left="720"/>
     </w:pPr>
     <w:rPr/>
+    <w:aliases w:val="List Paragraph"/>
     <w:unhideWhenUsed/>
     <w:qFormat/>
   </w:style>
@@ -1843,6 +1802,7 @@
       <w:widowControl w:val="1"/>
     </w:pPr>
     <w:rPr/>
+    <w:aliases w:val="No Spacing"/>
     <w:unhideWhenUsed/>
     <w:qFormat/>
   </w:style>
@@ -1853,11 +1813,12 @@
     <w:link w:val="Heading4"/>
     <w:rPr>
       <w:b w:val="true"/>
-      <w:rFonts w:asciiTheme="majorHAnsi" w:eastAsiaTheme="majorHAnsi" w:hAnsiTheme="majorHAnsi" w:cstheme="majorHAnsi"/>
+      <w:rFonts w:ascii="Roboto" w:eastAsia="Roboto" w:hAnsi="Roboto" w:cs="Roboto"/>
       <w:i w:val="true"/>
       <w:color w:val="000000" w:themeColor="dark1"/>
       <w:sz w:val="28"/>
     </w:rPr>
+    <w:aliases w:val="Heading 4 Char"/>
     <w:unhideWhenUsed/>
     <w:qFormat/>
   </w:style>
@@ -1868,11 +1829,12 @@
     <w:link w:val="Heading9"/>
     <w:rPr>
       <w:b w:val="true"/>
-      <w:rFonts w:asciiTheme="majorHAnsi" w:eastAsiaTheme="majorHAnsi" w:hAnsiTheme="majorHAnsi" w:cstheme="majorHAnsi"/>
+      <w:rFonts w:ascii="Roboto" w:eastAsia="Roboto" w:hAnsi="Roboto" w:cs="Roboto"/>
       <w:i w:val="true"/>
       <w:color w:val="26543D" w:themeColor="dark2"/>
       <w:sz w:val="20"/>
     </w:rPr>
+    <w:aliases w:val="Heading 9 Char"/>
     <w:unhideWhenUsed/>
     <w:qFormat/>
   </w:style>
@@ -1880,9 +1842,10 @@
     <w:name w:val="Default Paragraph Font"/>
     <w:uiPriority w:val="1"/>
     <w:rPr>
-      <w:rFonts w:asciiTheme="minorHAnsi" w:eastAsiaTheme="minorHAnsi" w:hAnsiTheme="minorHAnsi" w:cstheme="minorHAnsi"/>
+      <w:rFonts w:ascii="Roboto" w:eastAsia="Roboto" w:hAnsi="Roboto" w:cs="Roboto"/>
       <w:sz w:val="24"/>
     </w:rPr>
+    <w:aliases w:val="Default Paragraph Font"/>
     <w:unhideWhenUsed/>
     <w:qFormat/>
   </w:style>
@@ -1890,14 +1853,14 @@
     <w:name w:val="Subtitle Char"/>
     <w:uiPriority w:val="1"/>
     <w:basedOn w:val="DefaultParagraphFont"/>
-    <w:link w:val="Subtitle"/>
     <w:rPr>
       <w:b w:val="true"/>
-      <w:rFonts w:asciiTheme="minorHAnsi" w:eastAsiaTheme="minorHAnsi" w:hAnsiTheme="minorHAnsi" w:cstheme="minorHAnsi"/>
+      <w:rFonts w:ascii="Roboto" w:eastAsia="Roboto" w:hAnsi="Roboto" w:cs="Roboto"/>
       <w:i w:val="true"/>
       <w:color w:val="404040"/>
       <w:sz w:val="24"/>
     </w:rPr>
+    <w:aliases w:val="Subtitle Char"/>
     <w:unhideWhenUsed/>
     <w:qFormat/>
   </w:style>
@@ -1908,10 +1871,11 @@
     <w:link w:val="Heading2"/>
     <w:rPr>
       <w:b w:val="true"/>
-      <w:rFonts w:asciiTheme="majorHAnsi" w:eastAsiaTheme="majorHAnsi" w:hAnsiTheme="majorHAnsi" w:cstheme="majorHAnsi"/>
+      <w:rFonts w:ascii="Roboto" w:eastAsia="Roboto" w:hAnsi="Roboto" w:cs="Roboto"/>
       <w:color w:val="000000" w:themeColor="dark1"/>
       <w:sz w:val="36"/>
     </w:rPr>
+    <w:aliases w:val="Heading 2 Char"/>
     <w:unhideWhenUsed/>
     <w:qFormat/>
   </w:style>
@@ -1922,10 +1886,11 @@
     <w:link w:val="Heading8"/>
     <w:rPr>
       <w:b w:val="true"/>
-      <w:rFonts w:asciiTheme="majorHAnsi" w:eastAsiaTheme="majorHAnsi" w:hAnsiTheme="majorHAnsi" w:cstheme="majorHAnsi"/>
+      <w:rFonts w:ascii="Roboto" w:eastAsia="Roboto" w:hAnsi="Roboto" w:cs="Roboto"/>
       <w:color w:val="26543D" w:themeColor="dark2"/>
       <w:sz w:val="20"/>
     </w:rPr>
+    <w:aliases w:val="Heading 8 Char"/>
     <w:unhideWhenUsed/>
     <w:qFormat/>
   </w:style>
@@ -1935,12 +1900,13 @@
     <w:basedOn w:val="DefaultParagraphFont"/>
     <w:link w:val="Heading6"/>
     <w:rPr>
-      <w:rFonts w:asciiTheme="majorHAnsi" w:eastAsiaTheme="majorHAnsi" w:hAnsiTheme="majorHAnsi" w:cstheme="majorHAnsi"/>
+      <w:rFonts w:ascii="Roboto" w:eastAsia="Roboto" w:hAnsi="Roboto" w:cs="Roboto"/>
       <w:i w:val="true"/>
       <w:color w:val="000000" w:themeColor="dark1"/>
       <w:sz w:val="22"/>
       <w:u w:val="single"/>
     </w:rPr>
+    <w:aliases w:val="Heading 6 Char"/>
     <w:unhideWhenUsed/>
     <w:qFormat/>
   </w:style>
@@ -1949,11 +1915,12 @@
     <w:uiPriority w:val="1"/>
     <w:basedOn w:val="DefaultParagraphFont"/>
     <w:rPr>
-      <w:rFonts w:asciiTheme="minorHAnsi" w:eastAsiaTheme="minorHAnsi" w:hAnsiTheme="minorHAnsi" w:cstheme="minorHAnsi"/>
+      <w:rFonts w:ascii="Roboto" w:eastAsia="Roboto" w:hAnsi="Roboto" w:cs="Roboto"/>
       <w:i w:val="true"/>
       <w:color w:val="000000" w:themeColor="dark1" w:themeTint="3f"/>
       <w:sz w:val="24"/>
     </w:rPr>
+    <w:aliases w:val="Subtle Emphasis"/>
     <w:unhideWhenUsed/>
     <w:qFormat/>
   </w:style>
@@ -1962,10 +1929,11 @@
     <w:uiPriority w:val="1"/>
     <w:basedOn w:val="DefaultParagraphFont"/>
     <w:rPr>
-      <w:rFonts w:asciiTheme="minorHAnsi" w:eastAsiaTheme="minorHAnsi" w:hAnsiTheme="minorHAnsi" w:cstheme="minorHAnsi"/>
+      <w:rFonts w:ascii="Roboto" w:eastAsia="Roboto" w:hAnsi="Roboto" w:cs="Roboto"/>
       <w:i w:val="true"/>
       <w:sz w:val="24"/>
     </w:rPr>
+    <w:aliases w:val="Emphasis"/>
     <w:unhideWhenUsed/>
     <w:qFormat/>
   </w:style>
@@ -1975,10 +1943,11 @@
     <w:basedOn w:val="DefaultParagraphFont"/>
     <w:rPr>
       <w:b w:val="true"/>
-      <w:rFonts w:asciiTheme="minorHAnsi" w:eastAsiaTheme="minorHAnsi" w:hAnsiTheme="minorHAnsi" w:cstheme="minorHAnsi"/>
+      <w:rFonts w:ascii="Roboto" w:eastAsia="Roboto" w:hAnsi="Roboto" w:cs="Roboto"/>
       <w:i w:val="true"/>
       <w:sz w:val="24"/>
     </w:rPr>
+    <w:aliases w:val="Intense Emphasis"/>
     <w:unhideWhenUsed/>
     <w:qFormat/>
   </w:style>
@@ -1989,11 +1958,12 @@
     <w:link w:val="Title"/>
     <w:rPr>
       <w:b w:val="true"/>
-      <w:rFonts w:asciiTheme="majorHAnsi" w:eastAsiaTheme="majorHAnsi" w:hAnsiTheme="majorHAnsi" w:cstheme="majorHAnsi"/>
+      <w:rFonts w:ascii="Roboto" w:eastAsia="Roboto" w:hAnsi="Roboto" w:cs="Roboto"/>
       <w:color w:val="447DE2" w:themeColor="accent1" w:themeShade="BF"/>
       <w:spacing w:val="0"/>
       <w:sz w:val="72"/>
     </w:rPr>
+    <w:aliases w:val="Title Char"/>
     <w:unhideWhenUsed/>
     <w:qFormat/>
   </w:style>
@@ -2003,9 +1973,10 @@
     <w:basedOn w:val="DefaultParagraphFont"/>
     <w:rPr>
       <w:b w:val="true"/>
-      <w:rFonts w:asciiTheme="minorHAnsi" w:eastAsiaTheme="minorHAnsi" w:hAnsiTheme="minorHAnsi" w:cstheme="minorHAnsi"/>
+      <w:rFonts w:ascii="Roboto" w:eastAsia="Roboto" w:hAnsi="Roboto" w:cs="Roboto"/>
       <w:sz w:val="24"/>
     </w:rPr>
+    <w:aliases w:val="Strong"/>
     <w:unhideWhenUsed/>
     <w:qFormat/>
   </w:style>
@@ -2014,12 +1985,13 @@
     <w:uiPriority w:val="1"/>
     <w:basedOn w:val="DefaultParagraphFont"/>
     <w:rPr>
-      <w:rFonts w:asciiTheme="minorHAnsi" w:eastAsiaTheme="minorHAnsi" w:hAnsiTheme="minorHAnsi" w:cstheme="minorHAnsi"/>
+      <w:rFonts w:ascii="Roboto" w:eastAsia="Roboto" w:hAnsi="Roboto" w:cs="Roboto"/>
       <w:color w:val="000000" w:themeColor="dark1" w:themeTint="3f"/>
       <w:sz w:val="24"/>
       <w:u w:val="single"/>
       <w:smallCaps/>
     </w:rPr>
+    <w:aliases w:val="Subtle Reference"/>
     <w:unhideWhenUsed/>
     <w:qFormat/>
   </w:style>
@@ -2029,12 +2001,13 @@
     <w:basedOn w:val="DefaultParagraphFont"/>
     <w:rPr>
       <w:b w:val="true"/>
-      <w:rFonts w:asciiTheme="minorHAnsi" w:eastAsiaTheme="minorHAnsi" w:hAnsiTheme="minorHAnsi" w:cstheme="minorHAnsi"/>
+      <w:rFonts w:ascii="Roboto" w:eastAsia="Roboto" w:hAnsi="Roboto" w:cs="Roboto"/>
       <w:spacing w:val="0"/>
       <w:sz w:val="24"/>
       <w:u w:val="single"/>
       <w:smallCaps/>
     </w:rPr>
+    <w:aliases w:val="Intense Reference"/>
     <w:unhideWhenUsed/>
     <w:qFormat/>
   </w:style>
@@ -2044,10 +2017,11 @@
     <w:basedOn w:val="DefaultParagraphFont"/>
     <w:rPr>
       <w:b w:val="true"/>
-      <w:rFonts w:asciiTheme="minorHAnsi" w:eastAsiaTheme="minorHAnsi" w:hAnsiTheme="minorHAnsi" w:cstheme="minorHAnsi"/>
+      <w:rFonts w:ascii="Roboto" w:eastAsia="Roboto" w:hAnsi="Roboto" w:cs="Roboto"/>
       <w:sz w:val="24"/>
       <w:smallCaps/>
     </w:rPr>
+    <w:aliases w:val="Book Title"/>
     <w:unhideWhenUsed/>
     <w:qFormat/>
   </w:style>
@@ -2057,11 +2031,12 @@
     <w:basedOn w:val="DefaultParagraphFont"/>
     <w:link w:val="Heading7"/>
     <w:rPr>
-      <w:rFonts w:asciiTheme="majorHAnsi" w:eastAsiaTheme="majorHAnsi" w:hAnsiTheme="majorHAnsi" w:cstheme="majorHAnsi"/>
+      <w:rFonts w:ascii="Roboto" w:eastAsia="Roboto" w:hAnsi="Roboto" w:cs="Roboto"/>
       <w:i w:val="true"/>
       <w:color w:val="447DE2" w:themeColor="accent1" w:themeShade="7F"/>
       <w:sz w:val="20"/>
     </w:rPr>
+    <w:aliases w:val="Heading 7 Char"/>
     <w:unhideWhenUsed/>
     <w:qFormat/>
   </w:style>
@@ -2072,10 +2047,11 @@
     <w:link w:val="Heading1"/>
     <w:rPr>
       <w:b w:val="true"/>
-      <w:rFonts w:asciiTheme="majorHAnsi" w:eastAsiaTheme="majorHAnsi" w:hAnsiTheme="majorHAnsi" w:cstheme="majorHAnsi"/>
+      <w:rFonts w:ascii="Roboto" w:eastAsia="Roboto" w:hAnsi="Roboto" w:cs="Roboto"/>
       <w:color w:val="000000" w:themeColor="dark1" w:themeTint="F2"/>
       <w:sz w:val="48"/>
     </w:rPr>
+    <w:aliases w:val="Heading 1 Char"/>
     <w:unhideWhenUsed/>
     <w:qFormat/>
   </w:style>
@@ -2086,10 +2062,11 @@
     <w:link w:val="Heading3"/>
     <w:rPr>
       <w:b w:val="true"/>
-      <w:rFonts w:asciiTheme="majorHAnsi" w:eastAsiaTheme="majorHAnsi" w:hAnsiTheme="majorHAnsi" w:cstheme="majorHAnsi"/>
+      <w:rFonts w:ascii="Roboto" w:eastAsia="Roboto" w:hAnsi="Roboto" w:cs="Roboto"/>
       <w:color w:val="000000" w:themeColor="dark1"/>
       <w:sz w:val="32"/>
     </w:rPr>
+    <w:aliases w:val="Heading 3 Char"/>
     <w:unhideWhenUsed/>
     <w:qFormat/>
   </w:style>
@@ -2099,10 +2076,11 @@
     <w:basedOn w:val="DefaultParagraphFont"/>
     <w:link w:val="Heading5"/>
     <w:rPr>
-      <w:rFonts w:asciiTheme="majorHAnsi" w:eastAsiaTheme="majorHAnsi" w:hAnsiTheme="majorHAnsi" w:cstheme="majorHAnsi"/>
+      <w:rFonts w:ascii="Roboto" w:eastAsia="Roboto" w:hAnsi="Roboto" w:cs="Roboto"/>
       <w:color w:val="FFFFFF" w:themeColor="light1"/>
       <w:sz w:val="24"/>
     </w:rPr>
+    <w:aliases w:val="Heading 5 Char"/>
     <w:unhideWhenUsed/>
     <w:qFormat/>
   </w:style>

</xml_diff>